<commit_message>
Klaster 1: dokumen Telaah dikembalikan apa adanya, slide dan HTML mengikuti dokumen
Dokumen Word tidak disunting. Slide memakai file asli (animasi utuh) dengan
dua perubahan kecil agar sama dengan dokumen. Data interaktif dipakai apa
adanya karena sudah cocok dengan Lampiran I.

Co-Authored-By: Claude Fable 5.1 <noreply@anthropic.com>
Claude-Session: https://claude.ai/code/session_01YRzsgeieNDAiMxdefdbbP3
</commit_message>
<xml_diff>
--- a/presentasi/klaster1/BHP Medan - Telaah Poin 1 dan Klaster 1 - Tumpang Tindih Kewenangan.docx
+++ b/presentasi/klaster1/BHP Medan - Telaah Poin 1 dan Klaster 1 - Tumpang Tindih Kewenangan.docx
@@ -719,7 +719,7 @@
                 <w:sz w:val="18"/>
                 <w:szCs w:val="18"/>
               </w:rPr>
-              <w:t xml:space="preserve">2026 (sampai dengan 2 Oktober)</w:t>
+              <w:t>2026 (s.d. 2 Oktober)</w:t>
             </w:r>
           </w:p>
         </w:tc>
@@ -1306,7 +1306,7 @@
         <w:t xml:space="preserve">Kendala. </w:t>
       </w:r>
       <w:r>
-        <w:t xml:space="preserve">Pada kepailitan PT Jasa Prima Mandiri (2015 sampai dengan 2019), BHP Medan bekerja bersama kurator perseorangan. Kerja sama berjalan baik dan harta Rp12,85 miliar berhasil dibereskan. Namun ada tiga hal yang belum diatur:</w:t>
+        <w:t>Pada kepailitan PT Jasa Prima Mandiri (2015 s.d. 2019), BHP Medan bekerja bersama kurator perseorangan. Kerja sama berjalan baik dan harta Rp12,85 miliar berhasil dibereskan. Namun ada tiga hal yang belum diatur:</w:t>
       </w:r>
     </w:p>
     <w:p>
@@ -1348,13 +1348,13 @@
         <w:jc w:val="both"/>
       </w:pPr>
       <w:r>
-        <w:t xml:space="preserve">ukuran profesi yang sama, karena kurator perseorangan mengikuti kode etik asosiasinya, sedangkan BHP mengikuti kode etik aparatur sipil negara.</w:t>
-      </w:r>
-      <w:r>
-        <w:t xml:space="preserve"/>
-      </w:r>
-      <w:r>
-        <w:t xml:space="preserve"/>
+        <w:t xml:space="preserve">ukuran profesi yang sama, karena kurator perseorangan mengikuti kode etik asosiasinya, sedangkan BHP mengikuti aturan </w:t>
+      </w:r>
+      <w:r>
+        <w:t>kode etik pegawai negeri sipil</w:t>
+      </w:r>
+      <w:r>
+        <w:t>.</w:t>
       </w:r>
     </w:p>
     <w:p>
@@ -1696,7 +1696,7 @@
         <w:jc w:val="both"/>
       </w:pPr>
       <w:r>
-        <w:t xml:space="preserve">Satu standar profesi bagi BHP dan kurator perseorangan, dengan kode etik yang tetap mengikuti jalur masing-masing: kode etik aparatur sipil negara untuk BHP dan kode etik organisasi profesi untuk kurator perseorangan.</w:t>
+        <w:t>Satu standar profesi dan kode etik bagi BHP dan kurator perseorangan.</w:t>
       </w:r>
     </w:p>
     <w:p>
@@ -1791,7 +1791,7 @@
         <w:t>Dalam kepailitan, BHP berkedudukan sebagai kurator sebagaimana kurator perseorangan yang diangkat pengadilan.</w:t>
       </w:r>
       <w:r>
-        <w:t xml:space="preserve"> Sedangkan dalam tugas pokok dan fungsi lain, BHP berkedudukan sebagai wali pengawas, pengampu pengawas, pengurus harta orang yang tidak hadir, dan pengurus harta peninggalan tak terurus sebagaimana diatur dalam KUHPerdata.</w:t>
+        <w:t xml:space="preserve"> Sedangkan dalam tugas pokok dan fungsi lain, BHP berkedudukan sebagai wali pengawas, pendamping pengawas, dll sebagaimana yang diatur dalam KUHPerdata.</w:t>
       </w:r>
     </w:p>
     <w:p>
@@ -2481,7 +2481,7 @@
                 <w:sz w:val="18"/>
                 <w:szCs w:val="18"/>
               </w:rPr>
-              <w:t xml:space="preserve">Peraturan Menteri Hukum dan HAM Nomor 20 Tahun 2019 sebagaimana diubah dengan Peraturan Menteri Hukum dan HAM Nomor 4 Tahun 2024</w:t>
+              <w:t>Peraturan Menteri Hukum dan HAM Nomor 7 Tahun 2021</w:t>
             </w:r>
           </w:p>
         </w:tc>
@@ -2740,16 +2740,16 @@
         <w:t xml:space="preserve"> keperdataan menurut KUHPerdata</w:t>
       </w:r>
       <w:r>
-        <w:t xml:space="preserve">, yaitu BHP mengurus harta peninggalan</w:t>
-      </w:r>
-      <w:r>
-        <w:t xml:space="preserve">, harta orang yang tidak hadir, serta mengawasi wali dan pengampu; dan</w:t>
-      </w:r>
-      <w:r>
-        <w:t xml:space="preserve"/>
-      </w:r>
-      <w:r>
-        <w:t xml:space="preserve"/>
+        <w:t xml:space="preserve">, dimana </w:t>
+      </w:r>
+      <w:r>
+        <w:t>BHP mengurus harta peninggalan, harta orang yang tidak hadir, serta mengawasi wali dan pengampu</w:t>
+      </w:r>
+      <w:r>
+        <w:t>, dan lain sebagainya;</w:t>
+      </w:r>
+      <w:r>
+        <w:t xml:space="preserve"> dan</w:t>
       </w:r>
     </w:p>
     <w:p>
@@ -2769,13 +2769,13 @@
         <w:t>ebagai kurator negara menurut undang-undang kepailitan</w:t>
       </w:r>
       <w:r>
-        <w:t xml:space="preserve">, yaitu BHP sebagai kurator melaksanakan</w:t>
-      </w:r>
-      <w:r>
-        <w:t xml:space="preserve"/>
-      </w:r>
-      <w:r>
-        <w:t xml:space="preserve"> pengurusan dan pemberesan</w:t>
+        <w:t>, dimana BHP sebagai kurator</w:t>
+      </w:r>
+      <w:r>
+        <w:t xml:space="preserve"> </w:t>
+      </w:r>
+      <w:r>
+        <w:t>melaksanakan pengurusan dan pemberesan</w:t>
       </w:r>
       <w:r>
         <w:t xml:space="preserve"> harta pailit</w:t>
@@ -2791,25 +2791,25 @@
         <w:jc w:val="both"/>
       </w:pPr>
       <w:r>
-        <w:t xml:space="preserve">Apabila dalam suatu kepailitan terdapat tugas keperdataan BHP, misalnya debitor meninggal tanpa ahli waris atau ada kreditor yang tidak dapat ditemukan lagi orangnya, tugas keperdataan itu harus dijalankan oleh pejabat BHP sebagai pelaksana tugas keperdataan, sehingga tidak ada lagi kerancuan, misalnya mengenai siapa yang berhak atas sisa harta setelah utang dibayar.</w:t>
-      </w:r>
-      <w:r>
-        <w:t xml:space="preserve"/>
-      </w:r>
-      <w:r>
-        <w:t xml:space="preserve"/>
-      </w:r>
-      <w:r>
-        <w:t xml:space="preserve"/>
-      </w:r>
-      <w:r>
-        <w:t xml:space="preserve"/>
-      </w:r>
-      <w:r>
-        <w:t xml:space="preserve"/>
-      </w:r>
-      <w:r>
-        <w:t xml:space="preserve"/>
+        <w:t>Apabila</w:t>
+      </w:r>
+      <w:r>
+        <w:t xml:space="preserve"> </w:t>
+      </w:r>
+      <w:r>
+        <w:t>terjadi kepailitan yang di dalamnya terdapat tugas keperdataan BHP, seperti</w:t>
+      </w:r>
+      <w:r>
+        <w:t xml:space="preserve"> debitor meninggal tanpa ahli waris</w:t>
+      </w:r>
+      <w:r>
+        <w:t>, ada kreditor yang tidak dapat ditemukan lagi orangnya</w:t>
+      </w:r>
+      <w:r>
+        <w:t>,</w:t>
+      </w:r>
+      <w:r>
+        <w:t xml:space="preserve"> dll.</w:t>
       </w:r>
     </w:p>
     <w:p>
@@ -2819,7 +2819,33 @@
         <w:jc w:val="both"/>
       </w:pPr>
       <w:r>
-        <w:t xml:space="preserve">Dengan kata lain, dalam RUU yang baru BHP diharapkan memiliki kedudukan yang lebih jelas dan tegas dalam penanganan perkara kepailitan dengan karakteristik tertentu itu.</w:t>
+        <w:lastRenderedPageBreak/>
+        <w:t>Terhadap tugas keperdataan dalam kepailitan tersebut harus</w:t>
+      </w:r>
+      <w:r>
+        <w:t xml:space="preserve"> dijalankan oleh</w:t>
+      </w:r>
+      <w:r>
+        <w:t xml:space="preserve"> pejabat</w:t>
+      </w:r>
+      <w:r>
+        <w:t xml:space="preserve"> </w:t>
+      </w:r>
+      <w:r>
+        <w:t>BHP sebagai pelaksana tugas keperdataan</w:t>
+      </w:r>
+      <w:r>
+        <w:t xml:space="preserve"> sehingga tidak ada lagi kerancuan, misalnya mengenai siapa yang berhak atas sisa harta setelah utang dibayar.</w:t>
+      </w:r>
+    </w:p>
+    <w:p>
+      <w:pPr>
+        <w:spacing w:before="60" w:after="120" w:line="360" w:lineRule="auto"/>
+        <w:ind w:left="1854"/>
+        <w:jc w:val="both"/>
+      </w:pPr>
+      <w:r>
+        <w:t>Atau dengan kata lain, harapannya di dalam RUU baru, BHP dapat memilki kedudukan yang lebih jelas dan tegas dalam hal keterlibatan penanganan kasus kepailitan dengan karakteristik tertentu itu.</w:t>
       </w:r>
     </w:p>
     <w:p>
@@ -3786,21 +3812,21 @@
                 <w:sz w:val="18"/>
                 <w:szCs w:val="18"/>
               </w:rPr>
-              <w:t xml:space="preserve">Upah buruh didahulukan (Pasal 95 UU Ketenagakerjaan sebagaimana diubah dengan UU Cipta Kerja)</w:t>
-            </w:r>
-            <w:r>
-              <w:rPr>
-                <w:sz w:val="18"/>
-                <w:szCs w:val="18"/>
-              </w:rPr>
-              <w:t xml:space="preserve"/>
-            </w:r>
-            <w:r>
-              <w:rPr>
-                <w:sz w:val="18"/>
-                <w:szCs w:val="18"/>
-              </w:rPr>
-              <w:t xml:space="preserve"/>
+              <w:t xml:space="preserve">Upah </w:t>
+            </w:r>
+            <w:r>
+              <w:rPr>
+                <w:sz w:val="18"/>
+                <w:szCs w:val="18"/>
+              </w:rPr>
+              <w:t>buruh</w:t>
+            </w:r>
+            <w:r>
+              <w:rPr>
+                <w:sz w:val="18"/>
+                <w:szCs w:val="18"/>
+              </w:rPr>
+              <w:t xml:space="preserve"> didahulukan (Pasal 95 UU Ketenagakerjaan)</w:t>
             </w:r>
           </w:p>
         </w:tc>
@@ -5067,21 +5093,21 @@
                 <w:sz w:val="18"/>
                 <w:szCs w:val="18"/>
               </w:rPr>
-              <w:t xml:space="preserve">Debitor meninggal dan ahli waris tidak diketahui; perkara berjalan 10,6 tahun.</w:t>
-            </w:r>
-            <w:r>
-              <w:rPr>
-                <w:sz w:val="18"/>
-                <w:szCs w:val="18"/>
-              </w:rPr>
-              <w:t xml:space="preserve"/>
-            </w:r>
-            <w:r>
-              <w:rPr>
-                <w:sz w:val="18"/>
-                <w:szCs w:val="18"/>
-              </w:rPr>
-              <w:t xml:space="preserve"/>
+              <w:t>Debitor meninggal dan ahli waris tidak diketahui; perkara berjalan 10</w:t>
+            </w:r>
+            <w:r>
+              <w:rPr>
+                <w:sz w:val="18"/>
+                <w:szCs w:val="18"/>
+              </w:rPr>
+              <w:t xml:space="preserve"> </w:t>
+            </w:r>
+            <w:r>
+              <w:rPr>
+                <w:sz w:val="18"/>
+                <w:szCs w:val="18"/>
+              </w:rPr>
+              <w:t>tahun.</w:t>
             </w:r>
           </w:p>
         </w:tc>
@@ -5808,14 +5834,14 @@
                 <w:sz w:val="18"/>
                 <w:szCs w:val="18"/>
               </w:rPr>
-              <w:t xml:space="preserve">kode etik tetap mengikuti jalur masing-masing, yaitu kode etik aparatur sipil negara untuk BHP dan kode etik organisasi profesi untuk kurator perseorangan.</w:t>
-            </w:r>
-            <w:r>
-              <w:rPr>
-                <w:sz w:val="18"/>
-                <w:szCs w:val="18"/>
-              </w:rPr>
-              <w:t xml:space="preserve"/>
+              <w:t>namun kode etik tetap berbeda karena BHP tunduk pada kode etik ASN, sedangkan kurator perseorangan tunduk pada kode etik profesi dari organisasi profesi.</w:t>
+            </w:r>
+            <w:r>
+              <w:rPr>
+                <w:sz w:val="18"/>
+                <w:szCs w:val="18"/>
+              </w:rPr>
+              <w:t>.</w:t>
             </w:r>
           </w:p>
         </w:tc>
@@ -5989,10 +6015,10 @@
         <w:ind w:left="5245"/>
       </w:pPr>
       <w:r>
-        <w:t xml:space="preserve">Kepala Balai Harta Peninggalan Medan,</w:t>
-      </w:r>
-      <w:r>
-        <w:t xml:space="preserve"/>
+        <w:t>Kepala</w:t>
+      </w:r>
+      <w:r>
+        <w:t>,</w:t>
       </w:r>
     </w:p>
     <w:p>
@@ -6007,7 +6033,7 @@
           <w:b/>
           <w:bCs/>
         </w:rPr>
-        <w:t xml:space="preserve">Syafriadi Lubis, M.H.</w:t>
+        <w:t>Syafriadi Lubis</w:t>
       </w:r>
     </w:p>
     <w:p>
@@ -9410,7 +9436,7 @@
                 <w:sz w:val="18"/>
                 <w:szCs w:val="18"/>
               </w:rPr>
-              <w:t xml:space="preserve">2026 (sampai dengan September)</w:t>
+              <w:t>2026 (s.d. September)</w:t>
             </w:r>
           </w:p>
         </w:tc>
@@ -9949,7 +9975,7 @@
           <w:sz w:val="18"/>
           <w:szCs w:val="18"/>
         </w:rPr>
-        <w:t xml:space="preserve">Tabel I.2. Sumber: Buku Register Kepailitan BHP Medan. Penunjukan baru 2025 adalah perkara Frans Winner; perkara CV Riau Sukses Abadi, yang menurut SIPP juga mengangkat BHP pada 2025, tidak tercatat dalam register karena salinan putusannya tidak pernah diterima BHP. Pengakhiran kepailitan PT Pro Mekanika Indonusa telah dimohonkan dan belum diputus.</w:t>
+        <w:t>Tabel I.2. Sumber: Buku Register Kepailitan BHP Medan. Penunjukan baru 2025 adalah perkara Frans Winner. Pengakhiran kepailitan PT Pro Mekanika Indonusa telah dimohonkan dan belum diputus.</w:t>
       </w:r>
     </w:p>
     <w:tbl>
@@ -10449,7 +10475,7 @@
                 <w:sz w:val="18"/>
                 <w:szCs w:val="18"/>
               </w:rPr>
-              <w:t xml:space="preserve">2026 (sampai dengan 2 Oktober)</w:t>
+              <w:t>2026 (s.d. 2 Oktober)</w:t>
             </w:r>
           </w:p>
         </w:tc>

</xml_diff>